<commit_message>
Update Minh Duc Trinh_Resume.docx
</commit_message>
<xml_diff>
--- a/Minh Duc Trinh_Resume.docx
+++ b/Minh Duc Trinh_Resume.docx
@@ -134,7 +134,25 @@
                                   <w:sz w:val="22"/>
                                   <w:szCs w:val="22"/>
                                 </w:rPr>
-                                <w:t>Click here</w:t>
+                                <w:t>Clic</w:t>
+                              </w:r>
+                              <w:r>
+                                <w:rPr>
+                                  <w:rStyle w:val="Hyperlink"/>
+                                  <w:rFonts w:ascii="Times New Roman" w:hAnsi="Times New Roman" w:cs="Times New Roman"/>
+                                  <w:sz w:val="22"/>
+                                  <w:szCs w:val="22"/>
+                                </w:rPr>
+                                <w:t>k</w:t>
+                              </w:r>
+                              <w:r>
+                                <w:rPr>
+                                  <w:rStyle w:val="Hyperlink"/>
+                                  <w:rFonts w:ascii="Times New Roman" w:hAnsi="Times New Roman" w:cs="Times New Roman"/>
+                                  <w:sz w:val="22"/>
+                                  <w:szCs w:val="22"/>
+                                </w:rPr>
+                                <w:t xml:space="preserve"> here</w:t>
                               </w:r>
                             </w:hyperlink>
                           </w:p>
@@ -223,7 +241,25 @@
                             <w:sz w:val="22"/>
                             <w:szCs w:val="22"/>
                           </w:rPr>
-                          <w:t>Click here</w:t>
+                          <w:t>Clic</w:t>
+                        </w:r>
+                        <w:r>
+                          <w:rPr>
+                            <w:rStyle w:val="Hyperlink"/>
+                            <w:rFonts w:ascii="Times New Roman" w:hAnsi="Times New Roman" w:cs="Times New Roman"/>
+                            <w:sz w:val="22"/>
+                            <w:szCs w:val="22"/>
+                          </w:rPr>
+                          <w:t>k</w:t>
+                        </w:r>
+                        <w:r>
+                          <w:rPr>
+                            <w:rStyle w:val="Hyperlink"/>
+                            <w:rFonts w:ascii="Times New Roman" w:hAnsi="Times New Roman" w:cs="Times New Roman"/>
+                            <w:sz w:val="22"/>
+                            <w:szCs w:val="22"/>
+                          </w:rPr>
+                          <w:t xml:space="preserve"> here</w:t>
                         </w:r>
                       </w:hyperlink>
                     </w:p>
@@ -5268,6 +5304,7 @@
   <w:style w:type="character" w:default="1" w:styleId="DefaultParagraphFont">
     <w:name w:val="Default Paragraph Font"/>
     <w:uiPriority w:val="1"/>
+    <w:semiHidden/>
     <w:unhideWhenUsed/>
   </w:style>
   <w:style w:type="table" w:default="1" w:styleId="TableNormal">

</xml_diff>